<commit_message>
docs: incorporate Kit paper review
</commit_message>
<xml_diff>
--- a/docs/reports/paper-final.docx
+++ b/docs/reports/paper-final.docx
@@ -7575,7 +7575,7 @@
         <w:jc w:val="both"/>
       </w:pPr>
       <w:r>
-        <w:t>A stratified 75 percent training and 25 percent test split uses random state 42. The resulting arrays contain 109,188 training rows and 36,396 test rows. Features are float64 and labels are fixed width Unicode. A StandardScaler is fit on the training partition and saved, but the TabNet training functions do not apply it. The updated inference bridge passes raw engineered features to TabNet to match its training representation; a real TabNet API request remains unverified. Tree models also use the unscaled engineered representation. The saved JSON manifests specify the input order, class order, and frozen split, while saved encoders provide the inference transformation.</w:t>
+        <w:t>A stratified 75 percent training and 25 percent test split uses random state 42. This ratio retains 39 of the 52 U2R records for training and places 13 in the test set, compared with about 10 U2R test records under an 80/20 split. Stratification preserves approximate class proportions in both partitions; without it, the small U2R count could vary widely across reruns. The larger test share improves the visibility of rare-class errors, although 13 cases remain a small support.</w:t>
       </w:r>
     </w:p>
     <w:p>
@@ -11324,13 +11324,7 @@
         <w:jc w:val="both"/>
       </w:pPr>
       <w:r>
-        <w:rPr>
-          <w:rFonts w:ascii="Times New Roman" w:hAnsi="Times New Roman" w:eastAsia="Times New Roman" w:cs="Times New Roman"/>
-          <w:b w:val="0"/>
-          <w:color w:val="000000"/>
-          <w:sz w:val="22"/>
-        </w:rPr>
-        <w:t>TabNet uses 20 configured Optuna trials and three stratified validation folds. With 39 U2R training records, three folds place approximately 13 examples in each validation fold, compared with roughly seven or eight under five folds. This increases support per fold but does not establish that the rare class estimate is stable. The different fold counts must remain visible when comparing the algorithms. Tomek Links is restricted to fold training subsets. The final refit includes an internal 10 percent validation subset for early stopping rather than unrestricted training on the entire pool.</w:t>
+        <w:t>TabNet uses 20 configured Optuna trials and three stratified validation folds. This fold count was specified in the Role 5 execution contract before training as a design choice for increasing rare-class support, rather than selected after results were observed. With 39 U2R training records, three folds place approximately 13 examples in each validation fold, compared with roughly seven or eight under five folds. This increases support per fold but does not establish that the rare class estimate is stable. The different fold counts must remain visible when comparing the algorithms. Tomek Links is restricted to fold-training subsets. The final refit includes an internal 10 percent validation subset for early stopping rather than unrestricted training on the entire pool (Network Guardian IDS Team, 2026b, 2026c).</w:t>
       </w:r>
     </w:p>
     <w:p>
@@ -11380,13 +11374,7 @@
         <w:jc w:val="both"/>
       </w:pPr>
       <w:r>
-        <w:rPr>
-          <w:rFonts w:ascii="Times New Roman" w:hAnsi="Times New Roman" w:eastAsia="Times New Roman" w:cs="Times New Roman"/>
-          <w:b w:val="0"/>
-          <w:color w:val="000000"/>
-          <w:sz w:val="22"/>
-        </w:rPr>
-        <w:t>The implementations use a shared random state and persist optimization studies for traceability. Optuna selects configurations according to validation Macro F1; pruning can stop unpromising trials before they consume the full budget (Akiba et al., 2019). Tomek Links removes selected boundary examples from fold training data, while validation subsets are not resampled. Class weights increase the contribution of less frequent classes. The final test partition is reserved for Notebook 03 and is not passed to model tuning functions.</w:t>
+        <w:t>The split and model runs use random state 42 where supported, and optimization studies are retained for traceability. Searches use bounded model-specific ranges, and Optuna evaluates mean validation Macro F1 across folds; pruning may stop unpromising trials early (Akiba et al., 2019). XGBoost depth is bounded at 3 to 10, its minimum child weight at 1 or greater, reg_alpha at 0 to 10, and reg_lambda at 1 to 20; TabNet n_steps is bounded at 3 to 7. Tomek Links and class weighting are applied to fold-training data, not validation data. The model objective functions do not accept X_test or y_test; the frozen test partition is reserved for final evaluation. Encoders and the saved scaler are fit on the training partition, excluding the held-out test set. However, data-dependent feature pruning and encoders were not refit within each cross-validation fold, so validation-fold covariates contributed to preprocessing. These controls protect the test boundary and constrain search, but do not remove that cross-validation exposure or establish that overfitting is absent.</w:t>
       </w:r>
     </w:p>
     <w:p>
@@ -11436,6 +11424,362 @@
         <w:t>The backend implements POST /api/analyze on localhost port 5000. It validates the 31 raw categorical and numerical request fields before starting the repository virtual environment Python interpreter. The bridge applies logarithmic transformations and the frozen encoders, reconstructs the 43 feature columns in their stored order, checks model metadata, and decodes probability columns using the model class identifiers. This avoids dependence on JSON key order and prevents incorrect family decoding when a classifier uses a different probability column order.</w:t>
       </w:r>
     </w:p>
+    <w:p>
+      <w:pPr>
+        <w:pStyle w:val="Caption"/>
+        <w:keepNext/>
+        <w:keepLines/>
+      </w:pPr>
+      <w:r>
+        <w:rPr>
+          <w:b/>
+        </w:rPr>
+        <w:t>Backend inference request and response flow</w:t>
+      </w:r>
+    </w:p>
+    <w:tbl>
+      <w:tblPr>
+        <w:tblStyle w:val="TableGrid"/>
+        <w:tblW w:type="auto" w:w="0"/>
+        <w:tblLayout w:type="fixed"/>
+        <w:tblLook w:firstColumn="1" w:firstRow="1" w:lastColumn="0" w:lastRow="0" w:noHBand="0" w:noVBand="1" w:val="04A0"/>
+      </w:tblPr>
+      <w:tblGrid>
+        <w:gridCol w:w="1872"/>
+        <w:gridCol w:w="1872"/>
+        <w:gridCol w:w="1872"/>
+        <w:gridCol w:w="1872"/>
+        <w:gridCol w:w="1872"/>
+      </w:tblGrid>
+      <w:tr>
+        <w:tc>
+          <w:tcPr>
+            <w:tcW w:type="dxa" w:w="2664"/>
+            <w:shd w:fill="DDEBF7"/>
+          </w:tcPr>
+          <w:p>
+            <w:pPr>
+              <w:spacing w:before="40" w:after="40"/>
+              <w:jc w:val="center"/>
+            </w:pPr>
+            <w:r/>
+            <w:r>
+              <w:rPr>
+                <w:rFonts w:ascii="Times New Roman" w:hAnsi="Times New Roman"/>
+                <w:b/>
+                <w:color w:val="1F4E79"/>
+                <w:sz w:val="16"/>
+              </w:rPr>
+              <w:t>Browser / Next.js</w:t>
+            </w:r>
+          </w:p>
+        </w:tc>
+        <w:tc>
+          <w:tcPr>
+            <w:tcW w:type="dxa" w:w="648"/>
+            <w:shd w:fill="FFFFFF"/>
+          </w:tcPr>
+          <w:p>
+            <w:pPr>
+              <w:spacing w:before="40" w:after="40"/>
+              <w:jc w:val="center"/>
+            </w:pPr>
+            <w:r/>
+            <w:r>
+              <w:rPr>
+                <w:rFonts w:ascii="Times New Roman" w:hAnsi="Times New Roman"/>
+                <w:b w:val="0"/>
+                <w:color w:val="0080A0"/>
+                <w:sz w:val="24"/>
+              </w:rPr>
+              <w:t>→</w:t>
+            </w:r>
+          </w:p>
+        </w:tc>
+        <w:tc>
+          <w:tcPr>
+            <w:tcW w:type="dxa" w:w="2664"/>
+            <w:shd w:fill="DDEBF7"/>
+          </w:tcPr>
+          <w:p>
+            <w:pPr>
+              <w:spacing w:before="40" w:after="40"/>
+              <w:jc w:val="center"/>
+            </w:pPr>
+            <w:r/>
+            <w:r>
+              <w:rPr>
+                <w:rFonts w:ascii="Times New Roman" w:hAnsi="Times New Roman"/>
+                <w:b/>
+                <w:color w:val="1F4E79"/>
+                <w:sz w:val="16"/>
+              </w:rPr>
+              <w:t>POST /api/analyze</w:t>
+            </w:r>
+          </w:p>
+        </w:tc>
+        <w:tc>
+          <w:tcPr>
+            <w:tcW w:type="dxa" w:w="648"/>
+            <w:shd w:fill="FFFFFF"/>
+          </w:tcPr>
+          <w:p>
+            <w:pPr>
+              <w:spacing w:before="40" w:after="40"/>
+              <w:jc w:val="center"/>
+            </w:pPr>
+            <w:r/>
+            <w:r>
+              <w:rPr>
+                <w:rFonts w:ascii="Times New Roman" w:hAnsi="Times New Roman"/>
+                <w:b w:val="0"/>
+                <w:color w:val="0080A0"/>
+                <w:sz w:val="24"/>
+              </w:rPr>
+              <w:t>→</w:t>
+            </w:r>
+          </w:p>
+        </w:tc>
+        <w:tc>
+          <w:tcPr>
+            <w:tcW w:type="dxa" w:w="2664"/>
+            <w:shd w:fill="DDEBF7"/>
+          </w:tcPr>
+          <w:p>
+            <w:pPr>
+              <w:spacing w:before="40" w:after="40"/>
+              <w:jc w:val="center"/>
+            </w:pPr>
+            <w:r/>
+            <w:r>
+              <w:rPr>
+                <w:rFonts w:ascii="Times New Roman" w:hAnsi="Times New Roman"/>
+                <w:b/>
+                <w:color w:val="1F4E79"/>
+                <w:sz w:val="16"/>
+              </w:rPr>
+              <w:t>Express validates 31 raw fields</w:t>
+            </w:r>
+          </w:p>
+        </w:tc>
+      </w:tr>
+      <w:tr>
+        <w:tc>
+          <w:tcPr>
+            <w:tcW w:type="dxa" w:w="2664"/>
+          </w:tcPr>
+          <w:p>
+            <w:pPr>
+              <w:spacing w:before="40" w:after="40"/>
+              <w:jc w:val="center"/>
+            </w:pPr>
+            <w:r/>
+            <w:r>
+              <w:rPr>
+                <w:rFonts w:ascii="Times New Roman" w:hAnsi="Times New Roman"/>
+                <w:b w:val="0"/>
+                <w:color w:val="0080A0"/>
+                <w:sz w:val="24"/>
+              </w:rPr>
+            </w:r>
+          </w:p>
+        </w:tc>
+        <w:tc>
+          <w:tcPr>
+            <w:tcW w:type="dxa" w:w="648"/>
+          </w:tcPr>
+          <w:p>
+            <w:pPr>
+              <w:spacing w:before="40" w:after="40"/>
+              <w:jc w:val="center"/>
+            </w:pPr>
+            <w:r/>
+            <w:r>
+              <w:rPr>
+                <w:rFonts w:ascii="Times New Roman" w:hAnsi="Times New Roman"/>
+                <w:b w:val="0"/>
+                <w:color w:val="0080A0"/>
+                <w:sz w:val="24"/>
+              </w:rPr>
+            </w:r>
+          </w:p>
+        </w:tc>
+        <w:tc>
+          <w:tcPr>
+            <w:tcW w:type="dxa" w:w="2664"/>
+          </w:tcPr>
+          <w:p>
+            <w:pPr>
+              <w:spacing w:before="40" w:after="40"/>
+              <w:jc w:val="center"/>
+            </w:pPr>
+            <w:r/>
+            <w:r>
+              <w:rPr>
+                <w:rFonts w:ascii="Times New Roman" w:hAnsi="Times New Roman"/>
+                <w:b w:val="0"/>
+                <w:color w:val="0080A0"/>
+                <w:sz w:val="24"/>
+              </w:rPr>
+            </w:r>
+          </w:p>
+        </w:tc>
+        <w:tc>
+          <w:tcPr>
+            <w:tcW w:type="dxa" w:w="648"/>
+          </w:tcPr>
+          <w:p>
+            <w:pPr>
+              <w:spacing w:before="40" w:after="40"/>
+              <w:jc w:val="center"/>
+            </w:pPr>
+            <w:r/>
+            <w:r>
+              <w:rPr>
+                <w:rFonts w:ascii="Times New Roman" w:hAnsi="Times New Roman"/>
+                <w:b w:val="0"/>
+                <w:color w:val="0080A0"/>
+                <w:sz w:val="24"/>
+              </w:rPr>
+            </w:r>
+          </w:p>
+        </w:tc>
+        <w:tc>
+          <w:tcPr>
+            <w:tcW w:type="dxa" w:w="2664"/>
+          </w:tcPr>
+          <w:p>
+            <w:pPr>
+              <w:spacing w:before="40" w:after="40"/>
+              <w:jc w:val="center"/>
+            </w:pPr>
+            <w:r/>
+            <w:r>
+              <w:rPr>
+                <w:rFonts w:ascii="Times New Roman" w:hAnsi="Times New Roman"/>
+                <w:b/>
+                <w:color w:val="0080A0"/>
+                <w:sz w:val="24"/>
+              </w:rPr>
+              <w:t>↓</w:t>
+            </w:r>
+          </w:p>
+        </w:tc>
+      </w:tr>
+      <w:tr>
+        <w:tc>
+          <w:tcPr>
+            <w:tcW w:type="dxa" w:w="2664"/>
+            <w:shd w:fill="E2F0D9"/>
+          </w:tcPr>
+          <w:p>
+            <w:pPr>
+              <w:spacing w:before="40" w:after="40"/>
+              <w:jc w:val="center"/>
+            </w:pPr>
+            <w:r/>
+            <w:r>
+              <w:rPr>
+                <w:rFonts w:ascii="Times New Roman" w:hAnsi="Times New Roman"/>
+                <w:b/>
+                <w:color w:val="375623"/>
+                <w:sz w:val="16"/>
+              </w:rPr>
+              <w:t>Browser displays result</w:t>
+            </w:r>
+          </w:p>
+        </w:tc>
+        <w:tc>
+          <w:tcPr>
+            <w:tcW w:type="dxa" w:w="648"/>
+            <w:shd w:fill="FFFFFF"/>
+          </w:tcPr>
+          <w:p>
+            <w:pPr>
+              <w:spacing w:before="40" w:after="40"/>
+              <w:jc w:val="center"/>
+            </w:pPr>
+            <w:r/>
+            <w:r>
+              <w:rPr>
+                <w:rFonts w:ascii="Times New Roman" w:hAnsi="Times New Roman"/>
+                <w:b w:val="0"/>
+                <w:color w:val="0080A0"/>
+                <w:sz w:val="24"/>
+              </w:rPr>
+              <w:t>←</w:t>
+            </w:r>
+          </w:p>
+        </w:tc>
+        <w:tc>
+          <w:tcPr>
+            <w:tcW w:type="dxa" w:w="2664"/>
+            <w:shd w:fill="E2F0D9"/>
+          </w:tcPr>
+          <w:p>
+            <w:pPr>
+              <w:spacing w:before="40" w:after="40"/>
+              <w:jc w:val="center"/>
+            </w:pPr>
+            <w:r/>
+            <w:r>
+              <w:rPr>
+                <w:rFonts w:ascii="Times New Roman" w:hAnsi="Times New Roman"/>
+                <w:b/>
+                <w:color w:val="375623"/>
+                <w:sz w:val="16"/>
+              </w:rPr>
+              <w:t>Express returns prediction JSON</w:t>
+            </w:r>
+          </w:p>
+        </w:tc>
+        <w:tc>
+          <w:tcPr>
+            <w:tcW w:type="dxa" w:w="648"/>
+            <w:shd w:fill="FFFFFF"/>
+          </w:tcPr>
+          <w:p>
+            <w:pPr>
+              <w:spacing w:before="40" w:after="40"/>
+              <w:jc w:val="center"/>
+            </w:pPr>
+            <w:r/>
+            <w:r>
+              <w:rPr>
+                <w:rFonts w:ascii="Times New Roman" w:hAnsi="Times New Roman"/>
+                <w:b w:val="0"/>
+                <w:color w:val="0080A0"/>
+                <w:sz w:val="24"/>
+              </w:rPr>
+              <w:t>←</w:t>
+            </w:r>
+          </w:p>
+        </w:tc>
+        <w:tc>
+          <w:tcPr>
+            <w:tcW w:type="dxa" w:w="2664"/>
+            <w:shd w:fill="E2F0D9"/>
+          </w:tcPr>
+          <w:p>
+            <w:pPr>
+              <w:spacing w:before="40" w:after="40"/>
+              <w:jc w:val="center"/>
+            </w:pPr>
+            <w:r/>
+            <w:r>
+              <w:rPr>
+                <w:rFonts w:ascii="Times New Roman" w:hAnsi="Times New Roman"/>
+                <w:b/>
+                <w:color w:val="375623"/>
+                <w:sz w:val="16"/>
+              </w:rPr>
+              <w:t>Python bridge loads model and encoders; builds 43 ordered features</w:t>
+            </w:r>
+          </w:p>
+        </w:tc>
+      </w:tr>
+    </w:tbl>
+    <w:p/>
     <w:p>
       <w:pPr>
         <w:spacing w:after="0" w:line="360" w:lineRule="auto"/>
@@ -20377,12 +20721,7 @@
         <w:jc w:val="both"/>
       </w:pPr>
       <w:r>
-        <w:rPr>
-          <w:rFonts w:ascii="Times New Roman" w:hAnsi="Times New Roman" w:eastAsia="Times New Roman" w:cs="Times New Roman"/>
-          <w:color w:val="000000"/>
-          <w:sz w:val="22"/>
-        </w:rPr>
-        <w:t>The XGBoost summary also ranks service_freq first, followed by count and src_bytes. flag_S0 and host statistics contribute to the displayed ordering. Agreement on some leading fields indicates shared use of the prepared representation, not proof that a field causes an intrusion or that the models use identical decision rules. Different model-output units qualify comparisons of SHAP magnitudes.</w:t>
+        <w:t>The XGBoost summary also ranks service_freq first, followed by count and src_bytes. flag_S0 and host statistics contribute to the displayed ordering. The dashboard handoff reports flag_S0 as the leading XGBoost feature under the model’s native feature_importances_ method; that is a different extraction method from the SHAP ranking shown here. The paper reports the SHAP plot’s service_freq ranking and does not treat the two rankings as contradictory measurements. Agreement on some leading fields indicates shared use of the prepared representation, not proof that a field causes an intrusion or that the models use identical decision rules. Different model-output units qualify comparisons of SHAP magnitudes.</w:t>
       </w:r>
     </w:p>
     <w:p>
@@ -20742,7 +21081,7 @@
         <w:jc w:val="both"/>
       </w:pPr>
       <w:r>
-        <w:t>A central methodological lesson was to distinguish preparation findings, training diagnostics, validation objectives, and held-out evaluation. Completed test exports now support model comparison. Sampled global explanations and one local success case are now included; explanations of missed attacks, comparable training metrics, corrected fold reporting, and deployment verification remain open. Numerical agreement alone does not resolve these questions.</w:t>
+        <w:t>A central methodological lesson was to distinguish preparation findings, training diagnostics, validation objectives, and held-out evaluation. Completed test exports now support model comparison. The sampled global explanations and one local success case do not explain the three missed U2R records; targeted local SHAP analysis on those specific rows would be needed for case-level explanations. Comparable training metrics, independent fold reporting, and model-specific deployment checks remain open. Numerical agreement alone does not resolve these questions.</w:t>
       </w:r>
     </w:p>
     <w:p>
@@ -20823,12 +21162,7 @@
         <w:ind w:firstLine="0"/>
       </w:pPr>
       <w:r>
-        <w:rPr>
-          <w:rFonts w:ascii="Times New Roman" w:hAnsi="Times New Roman" w:eastAsia="Times New Roman" w:cs="Times New Roman"/>
-          <w:color w:val="000000"/>
-          <w:sz w:val="24"/>
-        </w:rPr>
-        <w:t>What problem did we set out to solve and why does it matter</w:t>
+        <w:t>8.1 What problem did we set out to solve and why does it matter</w:t>
       </w:r>
     </w:p>
     <w:p>
@@ -20854,12 +21188,7 @@
         <w:ind w:firstLine="0"/>
       </w:pPr>
       <w:r>
-        <w:rPr>
-          <w:rFonts w:ascii="Times New Roman" w:hAnsi="Times New Roman" w:eastAsia="Times New Roman" w:cs="Times New Roman"/>
-          <w:color w:val="000000"/>
-          <w:sz w:val="24"/>
-        </w:rPr>
-        <w:t>What did we discover about the data that shaped our decisions</w:t>
+        <w:t>8.2 What did we discover about the data that shaped our decisions</w:t>
       </w:r>
     </w:p>
     <w:p>
@@ -20885,12 +21214,7 @@
         <w:ind w:firstLine="0"/>
       </w:pPr>
       <w:r>
-        <w:rPr>
-          <w:rFonts w:ascii="Times New Roman" w:hAnsi="Times New Roman" w:eastAsia="Times New Roman" w:cs="Times New Roman"/>
-          <w:color w:val="000000"/>
-          <w:sz w:val="24"/>
-        </w:rPr>
-        <w:t>Which approaches did we compare and how did we judge them</w:t>
+        <w:t>8.3 Which approaches did we compare and how did we judge them</w:t>
       </w:r>
     </w:p>
     <w:p>
@@ -20916,12 +21240,7 @@
         <w:ind w:firstLine="0"/>
       </w:pPr>
       <w:r>
-        <w:rPr>
-          <w:rFonts w:ascii="Times New Roman" w:hAnsi="Times New Roman" w:eastAsia="Times New Roman" w:cs="Times New Roman"/>
-          <w:color w:val="000000"/>
-          <w:sz w:val="24"/>
-        </w:rPr>
-        <w:t>What do we recommend and what evidence supports it</w:t>
+        <w:t>8.4 What do we recommend and what evidence supports it</w:t>
       </w:r>
     </w:p>
     <w:p>
@@ -20947,12 +21266,7 @@
         <w:ind w:firstLine="0"/>
       </w:pPr>
       <w:r>
-        <w:rPr>
-          <w:rFonts w:ascii="Times New Roman" w:hAnsi="Times New Roman" w:eastAsia="Times New Roman" w:cs="Times New Roman"/>
-          <w:color w:val="000000"/>
-          <w:sz w:val="24"/>
-        </w:rPr>
-        <w:t>What are the limitations of our work and what would we do next</w:t>
+        <w:t>8.5 What are the limitations of our work and what would we do next</w:t>
       </w:r>
     </w:p>
     <w:p>
@@ -20972,12 +21286,7 @@
         <w:ind w:firstLine="0"/>
       </w:pPr>
       <w:r>
-        <w:rPr>
-          <w:rFonts w:ascii="Times New Roman" w:hAnsi="Times New Roman" w:eastAsia="Times New Roman" w:cs="Times New Roman"/>
-          <w:color w:val="000000"/>
-          <w:sz w:val="24"/>
-        </w:rPr>
-        <w:t>What was our biggest mistake or surprise and what did we learn from it</w:t>
+        <w:t>8.6 What was our biggest mistake or surprise and what did we learn from it</w:t>
       </w:r>
     </w:p>
     <w:p>
@@ -21534,29 +21843,7 @@
         <w:jc w:val="left"/>
       </w:pPr>
       <w:r>
-        <w:rPr>
-          <w:rFonts w:ascii="Times New Roman" w:hAnsi="Times New Roman" w:eastAsia="Times New Roman" w:cs="Times New Roman"/>
-          <w:color w:val="000000"/>
-          <w:sz w:val="22"/>
-        </w:rPr>
-        <w:t xml:space="preserve">Network Guardian IDS Team. (2026a). </w:t>
-      </w:r>
-      <w:r>
-        <w:rPr>
-          <w:rFonts w:ascii="Times New Roman" w:hAnsi="Times New Roman" w:eastAsia="Times New Roman" w:cs="Times New Roman"/>
-          <w:i/>
-          <w:color w:val="000000"/>
-          <w:sz w:val="22"/>
-        </w:rPr>
-        <w:t>Environment and data preparation reports and reproducible artifacts</w:t>
-      </w:r>
-      <w:r>
-        <w:rPr>
-          <w:rFonts w:ascii="Times New Roman" w:hAnsi="Times New Roman" w:eastAsia="Times New Roman" w:cs="Times New Roman"/>
-          <w:color w:val="000000"/>
-          <w:sz w:val="22"/>
-        </w:rPr>
-        <w:t xml:space="preserve"> [Project documentation]. docs/reports/role-1-phase-1-kit-environment-setup.md; docs/reports/role-1-phase-2-kit-data-preparation.md; notebooks/01_EDA_and_Data_Prep.ipynb; data/processed/split_indices.json; data/processed/feature_names.json.</w:t>
+        <w:t>Network Guardian IDS Team. (2026a). Environment and data preparation reports and reproducible artifacts [Unpublished project documentation]. Network Guardian IDS repository. https://github.com/Dustin-Martinez/network-guardian-ids</w:t>
       </w:r>
     </w:p>
     <w:p>
@@ -21567,29 +21854,7 @@
         <w:jc w:val="left"/>
       </w:pPr>
       <w:r>
-        <w:rPr>
-          <w:rFonts w:ascii="Times New Roman" w:hAnsi="Times New Roman" w:eastAsia="Times New Roman" w:cs="Times New Roman"/>
-          <w:color w:val="000000"/>
-          <w:sz w:val="22"/>
-        </w:rPr>
-        <w:t xml:space="preserve">Network Guardian IDS Team. (2026b). </w:t>
-      </w:r>
-      <w:r>
-        <w:rPr>
-          <w:rFonts w:ascii="Times New Roman" w:hAnsi="Times New Roman" w:eastAsia="Times New Roman" w:cs="Times New Roman"/>
-          <w:i/>
-          <w:color w:val="000000"/>
-          <w:sz w:val="22"/>
-        </w:rPr>
-        <w:t>Model architecture and execution specifications</w:t>
-      </w:r>
-      <w:r>
-        <w:rPr>
-          <w:rFonts w:ascii="Times New Roman" w:hAnsi="Times New Roman" w:eastAsia="Times New Roman" w:cs="Times New Roman"/>
-          <w:color w:val="000000"/>
-          <w:sz w:val="22"/>
-        </w:rPr>
-        <w:t xml:space="preserve"> [Project documentation]. src/models.py; docs/contracts/role-3-rf-architecture-spec.md; docs/contracts/role-4-training-execution-spec.md; docs/contracts/role-5-training-execution-spec.md.</w:t>
+        <w:t>Network Guardian IDS Team. (2026b). Model architecture and execution specifications [Unpublished project documentation]. Network Guardian IDS repository. https://github.com/Dustin-Martinez/network-guardian-ids</w:t>
       </w:r>
     </w:p>
     <w:p>
@@ -21600,29 +21865,7 @@
         <w:jc w:val="left"/>
       </w:pPr>
       <w:r>
-        <w:rPr>
-          <w:rFonts w:ascii="Times New Roman" w:hAnsi="Times New Roman" w:eastAsia="Times New Roman" w:cs="Times New Roman"/>
-          <w:color w:val="000000"/>
-          <w:sz w:val="22"/>
-        </w:rPr>
-        <w:t xml:space="preserve">Network Guardian IDS Team. (2026c). </w:t>
-      </w:r>
-      <w:r>
-        <w:rPr>
-          <w:rFonts w:ascii="Times New Roman" w:hAnsi="Times New Roman" w:eastAsia="Times New Roman" w:cs="Times New Roman"/>
-          <w:i/>
-          <w:color w:val="000000"/>
-          <w:sz w:val="22"/>
-        </w:rPr>
-        <w:t>TabNet execution and artifact verification</w:t>
-      </w:r>
-      <w:r>
-        <w:rPr>
-          <w:rFonts w:ascii="Times New Roman" w:hAnsi="Times New Roman" w:eastAsia="Times New Roman" w:cs="Times New Roman"/>
-          <w:color w:val="000000"/>
-          <w:sz w:val="22"/>
-        </w:rPr>
-        <w:t xml:space="preserve"> [Unpublished research record]. docs/reports/role-5-tabnet-training-verification-report.md; outputs/02_training/optuna_tabnet_trials.csv; outputs/02_training/tabnet_cv_scores.csv.</w:t>
+        <w:t>Network Guardian IDS Team. (2026c). TabNet execution and artifact verification [Unpublished project documentation]. Network Guardian IDS repository. https://github.com/Dustin-Martinez/network-guardian-ids</w:t>
       </w:r>
     </w:p>
     <w:p>
@@ -21633,29 +21876,7 @@
         <w:jc w:val="left"/>
       </w:pPr>
       <w:r>
-        <w:rPr>
-          <w:rFonts w:ascii="Times New Roman" w:hAnsi="Times New Roman" w:eastAsia="Times New Roman" w:cs="Times New Roman"/>
-          <w:color w:val="000000"/>
-          <w:sz w:val="22"/>
-        </w:rPr>
-        <w:t xml:space="preserve">Network Guardian IDS Team. (2026d). </w:t>
-      </w:r>
-      <w:r>
-        <w:rPr>
-          <w:rFonts w:ascii="Times New Roman" w:hAnsi="Times New Roman" w:eastAsia="Times New Roman" w:cs="Times New Roman"/>
-          <w:i/>
-          <w:color w:val="000000"/>
-          <w:sz w:val="22"/>
-        </w:rPr>
-        <w:t>Frontend scaffold and API data contract</w:t>
-      </w:r>
-      <w:r>
-        <w:rPr>
-          <w:rFonts w:ascii="Times New Roman" w:hAnsi="Times New Roman" w:eastAsia="Times New Roman" w:cs="Times New Roman"/>
-          <w:color w:val="000000"/>
-          <w:sz w:val="22"/>
-        </w:rPr>
-        <w:t xml:space="preserve"> [Project documentation]. docs/reports/role-3-phase-1-amber-frontend-scaffold.md; docs/contracts/api_data_contract.md.</w:t>
+        <w:t>Network Guardian IDS Team. (2026d). Frontend scaffold and API data contract [Unpublished project documentation]. Network Guardian IDS repository. https://github.com/Dustin-Martinez/network-guardian-ids</w:t>
       </w:r>
     </w:p>
     <w:p>
@@ -21666,29 +21887,7 @@
         <w:jc w:val="left"/>
       </w:pPr>
       <w:r>
-        <w:rPr>
-          <w:rFonts w:ascii="Times New Roman" w:hAnsi="Times New Roman" w:eastAsia="Times New Roman" w:cs="Times New Roman"/>
-          <w:color w:val="000000"/>
-          <w:sz w:val="22"/>
-        </w:rPr>
-        <w:t xml:space="preserve">Network Guardian IDS Team. (2026e). </w:t>
-      </w:r>
-      <w:r>
-        <w:rPr>
-          <w:rFonts w:ascii="Times New Roman" w:hAnsi="Times New Roman" w:eastAsia="Times New Roman" w:cs="Times New Roman"/>
-          <w:i/>
-          <w:color w:val="000000"/>
-          <w:sz w:val="22"/>
-        </w:rPr>
-        <w:t>Role 2 documentation and setup verification</w:t>
-      </w:r>
-      <w:r>
-        <w:rPr>
-          <w:rFonts w:ascii="Times New Roman" w:hAnsi="Times New Roman" w:eastAsia="Times New Roman" w:cs="Times New Roman"/>
-          <w:color w:val="000000"/>
-          <w:sz w:val="22"/>
-        </w:rPr>
-        <w:t xml:space="preserve"> [Project documentation]. docs/reports/role-2-phase-1-markie-documentation-scaffolding.md; docs/reports/discovery_log.md.</w:t>
+        <w:t>Network Guardian IDS Team. (2026e). Role 2 documentation and setup verification [Unpublished project documentation]. Network Guardian IDS repository. https://github.com/Dustin-Martinez/network-guardian-ids</w:t>
       </w:r>
     </w:p>
     <w:p>
@@ -21699,29 +21898,7 @@
         <w:jc w:val="left"/>
       </w:pPr>
       <w:r>
-        <w:rPr>
-          <w:rFonts w:ascii="Times New Roman" w:hAnsi="Times New Roman" w:eastAsia="Times New Roman" w:cs="Times New Roman"/>
-          <w:color w:val="000000"/>
-          <w:sz w:val="22"/>
-        </w:rPr>
-        <w:t xml:space="preserve">Network Guardian IDS Team. (2026f). </w:t>
-      </w:r>
-      <w:r>
-        <w:rPr>
-          <w:rFonts w:ascii="Times New Roman" w:hAnsi="Times New Roman" w:eastAsia="Times New Roman" w:cs="Times New Roman"/>
-          <w:i/>
-          <w:color w:val="000000"/>
-          <w:sz w:val="22"/>
-        </w:rPr>
-        <w:t>Random Forest configuration and validation statistics</w:t>
-      </w:r>
-      <w:r>
-        <w:rPr>
-          <w:rFonts w:ascii="Times New Roman" w:hAnsi="Times New Roman" w:eastAsia="Times New Roman" w:cs="Times New Roman"/>
-          <w:color w:val="000000"/>
-          <w:sz w:val="22"/>
-        </w:rPr>
-        <w:t xml:space="preserve"> [Unpublished research record]. models/rf_baseline.meta.json; docs/reports/role-3-phase-2-amber-rf-baseline.md.</w:t>
+        <w:t>Network Guardian IDS Team. (2026f). Random Forest configuration and validation statistics [Unpublished project documentation]. Network Guardian IDS repository. https://github.com/Dustin-Martinez/network-guardian-ids</w:t>
       </w:r>
     </w:p>
     <w:p>
@@ -21732,29 +21909,7 @@
         <w:jc w:val="left"/>
       </w:pPr>
       <w:r>
-        <w:rPr>
-          <w:rFonts w:ascii="Times New Roman" w:hAnsi="Times New Roman" w:eastAsia="Times New Roman" w:cs="Times New Roman"/>
-          <w:color w:val="000000"/>
-          <w:sz w:val="22"/>
-        </w:rPr>
-        <w:t xml:space="preserve">Network Guardian IDS Team. (2026g). </w:t>
-      </w:r>
-      <w:r>
-        <w:rPr>
-          <w:rFonts w:ascii="Times New Roman" w:hAnsi="Times New Roman" w:eastAsia="Times New Roman" w:cs="Times New Roman"/>
-          <w:i/>
-          <w:color w:val="000000"/>
-          <w:sz w:val="22"/>
-        </w:rPr>
-        <w:t>Backend inference implementation and functional verification</w:t>
-      </w:r>
-      <w:r>
-        <w:rPr>
-          <w:rFonts w:ascii="Times New Roman" w:hAnsi="Times New Roman" w:eastAsia="Times New Roman" w:cs="Times New Roman"/>
-          <w:color w:val="000000"/>
-          <w:sz w:val="22"/>
-        </w:rPr>
-        <w:t xml:space="preserve"> [Unpublished research record]. docs/reports/role-2-phase-2-markie-backend-bridge.md; server/server.js; server/predict_bridge.py; server/validate.js; server/tests.</w:t>
+        <w:t>Network Guardian IDS Team. (2026g). Backend inference implementation and functional verification [Unpublished project documentation]. Network Guardian IDS repository. https://github.com/Dustin-Martinez/network-guardian-ids</w:t>
       </w:r>
     </w:p>
     <w:p>
@@ -21765,29 +21920,7 @@
         <w:jc w:val="left"/>
       </w:pPr>
       <w:r>
-        <w:rPr>
-          <w:rFonts w:ascii="Times New Roman" w:hAnsi="Times New Roman" w:eastAsia="Times New Roman" w:cs="Times New Roman"/>
-          <w:color w:val="000000"/>
-          <w:sz w:val="22"/>
-        </w:rPr>
-        <w:t xml:space="preserve">Network Guardian IDS Team. (2026h). </w:t>
-      </w:r>
-      <w:r>
-        <w:rPr>
-          <w:rFonts w:ascii="Times New Roman" w:hAnsi="Times New Roman" w:eastAsia="Times New Roman" w:cs="Times New Roman"/>
-          <w:i/>
-          <w:color w:val="000000"/>
-          <w:sz w:val="22"/>
-        </w:rPr>
-        <w:t>Frozen test evaluation and saved prediction outputs</w:t>
-      </w:r>
-      <w:r>
-        <w:rPr>
-          <w:rFonts w:ascii="Times New Roman" w:hAnsi="Times New Roman" w:eastAsia="Times New Roman" w:cs="Times New Roman"/>
-          <w:color w:val="000000"/>
-          <w:sz w:val="22"/>
-        </w:rPr>
-        <w:t xml:space="preserve"> [Research record]. docs/reports/role-5-phase-3-dwayne-evaluation-suite.md; outputs/03_evaluation/test_set_evaluation.json; outputs/03_evaluation/per_class_metrics.csv; outputs/03_evaluation/test_predictions.csv; outputs/03_evaluation/*.png.</w:t>
+        <w:t>Network Guardian IDS Team. (2026h). Frozen test evaluation and saved prediction outputs [Unpublished project documentation]. Network Guardian IDS repository. https://github.com/Dustin-Martinez/network-guardian-ids</w:t>
       </w:r>
     </w:p>
     <w:p>
@@ -21798,29 +21931,7 @@
         <w:jc w:val="left"/>
       </w:pPr>
       <w:r>
-        <w:rPr>
-          <w:rFonts w:ascii="Times New Roman" w:hAnsi="Times New Roman" w:eastAsia="Times New Roman" w:cs="Times New Roman"/>
-          <w:color w:val="000000"/>
-          <w:sz w:val="22"/>
-        </w:rPr>
-        <w:t xml:space="preserve">Network Guardian IDS Team. (2026i). </w:t>
-      </w:r>
-      <w:r>
-        <w:rPr>
-          <w:rFonts w:ascii="Times New Roman" w:hAnsi="Times New Roman" w:eastAsia="Times New Roman" w:cs="Times New Roman"/>
-          <w:i/>
-          <w:color w:val="000000"/>
-          <w:sz w:val="22"/>
-        </w:rPr>
-        <w:t>XGBoost execution and validation reporting</w:t>
-      </w:r>
-      <w:r>
-        <w:rPr>
-          <w:rFonts w:ascii="Times New Roman" w:hAnsi="Times New Roman" w:eastAsia="Times New Roman" w:cs="Times New Roman"/>
-          <w:color w:val="000000"/>
-          <w:sz w:val="22"/>
-        </w:rPr>
-        <w:t xml:space="preserve"> [Research record]. docs/reports/role-4-phase-2-kit-xgboost-execution.md; docs/handoffs/xgboost.md; outputs/02_training/optuna_xgb_trials.csv; src/models.py.</w:t>
+        <w:t>Network Guardian IDS Team. (2026i). XGBoost execution and validation reporting [Unpublished project documentation]. Network Guardian IDS repository. https://github.com/Dustin-Martinez/network-guardian-ids</w:t>
       </w:r>
     </w:p>
     <w:p>
@@ -21831,29 +21942,7 @@
         <w:jc w:val="left"/>
       </w:pPr>
       <w:r>
-        <w:rPr>
-          <w:rFonts w:ascii="Times New Roman" w:hAnsi="Times New Roman" w:eastAsia="Times New Roman" w:cs="Times New Roman"/>
-          <w:color w:val="000000"/>
-          <w:sz w:val="22"/>
-        </w:rPr>
-        <w:t xml:space="preserve">Network Guardian IDS Team. (2026j). </w:t>
-      </w:r>
-      <w:r>
-        <w:rPr>
-          <w:rFonts w:ascii="Times New Roman" w:hAnsi="Times New Roman" w:eastAsia="Times New Roman" w:cs="Times New Roman"/>
-          <w:i/>
-          <w:color w:val="000000"/>
-          <w:sz w:val="22"/>
-        </w:rPr>
-        <w:t>Random Forest acceptance threshold decision</w:t>
-      </w:r>
-      <w:r>
-        <w:rPr>
-          <w:rFonts w:ascii="Times New Roman" w:hAnsi="Times New Roman" w:eastAsia="Times New Roman" w:cs="Times New Roman"/>
-          <w:color w:val="000000"/>
-          <w:sz w:val="22"/>
-        </w:rPr>
-        <w:t xml:space="preserve"> [Project record]. docs/decision/decision_rf_cv_std_threshold_20261013.md.</w:t>
+        <w:t>Network Guardian IDS Team. (2026j). Random Forest acceptance threshold decision [Unpublished project documentation]. Network Guardian IDS repository. https://github.com/Dustin-Martinez/network-guardian-ids</w:t>
       </w:r>
     </w:p>
     <w:p>
@@ -21864,29 +21953,7 @@
         <w:jc w:val="left"/>
       </w:pPr>
       <w:r>
-        <w:rPr>
-          <w:rFonts w:ascii="Times New Roman" w:hAnsi="Times New Roman" w:eastAsia="Times New Roman" w:cs="Times New Roman"/>
-          <w:color w:val="000000"/>
-          <w:sz w:val="22"/>
-        </w:rPr>
-        <w:t xml:space="preserve">Network Guardian IDS Team. (2026k). </w:t>
-      </w:r>
-      <w:r>
-        <w:rPr>
-          <w:rFonts w:ascii="Times New Roman" w:hAnsi="Times New Roman" w:eastAsia="Times New Roman" w:cs="Times New Roman"/>
-          <w:i/>
-          <w:color w:val="000000"/>
-          <w:sz w:val="22"/>
-        </w:rPr>
-        <w:t>Frontend connection to the live backend</w:t>
-      </w:r>
-      <w:r>
-        <w:rPr>
-          <w:rFonts w:ascii="Times New Roman" w:hAnsi="Times New Roman" w:eastAsia="Times New Roman" w:cs="Times New Roman"/>
-          <w:color w:val="000000"/>
-          <w:sz w:val="22"/>
-        </w:rPr>
-        <w:t xml:space="preserve"> [Project record]. docs/reports/role-3-phase-3-amber-frontend-backend-integration.md; client/src/lib/data.ts.</w:t>
+        <w:t>Network Guardian IDS Team. (2026k). Frontend connection to the live backend [Unpublished project documentation]. Network Guardian IDS repository. https://github.com/Dustin-Martinez/network-guardian-ids</w:t>
       </w:r>
     </w:p>
     <w:p>
@@ -21897,29 +21964,7 @@
         <w:jc w:val="left"/>
       </w:pPr>
       <w:r>
-        <w:rPr>
-          <w:rFonts w:ascii="Times New Roman" w:hAnsi="Times New Roman" w:eastAsia="Times New Roman" w:cs="Times New Roman"/>
-          <w:color w:val="000000"/>
-          <w:sz w:val="22"/>
-        </w:rPr>
-        <w:t xml:space="preserve">Network Guardian IDS Team. (2026l). </w:t>
-      </w:r>
-      <w:r>
-        <w:rPr>
-          <w:rFonts w:ascii="Times New Roman" w:hAnsi="Times New Roman" w:eastAsia="Times New Roman" w:cs="Times New Roman"/>
-          <w:i/>
-          <w:color w:val="000000"/>
-          <w:sz w:val="22"/>
-        </w:rPr>
-        <w:t>Sampled model explanations and feature attention</w:t>
-      </w:r>
-      <w:r>
-        <w:rPr>
-          <w:rFonts w:ascii="Times New Roman" w:hAnsi="Times New Roman" w:eastAsia="Times New Roman" w:cs="Times New Roman"/>
-          <w:color w:val="000000"/>
-          <w:sz w:val="22"/>
-        </w:rPr>
-        <w:t xml:space="preserve"> [Research record]. docs/reports/role-5-phase-4-dwayne-explainability.md; src/explainability.py; outputs/03_evaluation/shap_summary_rf.png; shap_summary_xgb.png; shap_local_example.png; tabnet_attention_mask.png. Repository snapshot 7108f414c049ca265bdd6b305e979abcd7a5c614.</w:t>
+        <w:t>Network Guardian IDS Team. (2026l). Sampled model explanations and feature attention [Unpublished project documentation]. Network Guardian IDS repository. https://github.com/Dustin-Martinez/network-guardian-ids</w:t>
       </w:r>
     </w:p>
     <w:p>

</xml_diff>